<commit_message>
Continued working on Milestone 01
Started working on the research onion. Also added the book by Saunders.
</commit_message>
<xml_diff>
--- a/doc/miguelabela_swd63a_milestone_01.docx
+++ b/doc/miguelabela_swd63a_milestone_01.docx
@@ -368,7 +368,19 @@
         <w:rPr>
           <w:lang w:val="en-US"/>
         </w:rPr>
-        <w:t xml:space="preserve">The purpose of this experimental study is to investigate the use of </w:t>
+        <w:t>The purpose of this experimental study</w:t>
+      </w:r>
+      <w:r>
+        <w:rPr>
+          <w:lang w:val="en-US"/>
+        </w:rPr>
+        <w:t xml:space="preserve"> [8]</w:t>
+      </w:r>
+      <w:r>
+        <w:rPr>
+          <w:lang w:val="en-US"/>
+        </w:rPr>
+        <w:t xml:space="preserve"> is to investigate the use of </w:t>
       </w:r>
       <w:r>
         <w:rPr>
@@ -961,6 +973,97 @@
           <w:lang w:val="en-US"/>
         </w:rPr>
         <w:t>larger volumes of historical activity data (16-week training block), as this will supply the model with more comprehensive data about an individual's marathon buildup.</w:t>
+      </w:r>
+    </w:p>
+    <w:p>
+      <w:pPr>
+        <w:spacing w:line="360" w:lineRule="auto"/>
+        <w:jc w:val="both"/>
+        <w:rPr>
+          <w:lang w:val="en-US"/>
+        </w:rPr>
+      </w:pPr>
+      <w:r>
+        <w:rPr>
+          <w:lang w:val="en-US"/>
+        </w:rPr>
+        <w:t>In view of the previously indicated factors, as illustrated in Fig 1, during this research</w:t>
+      </w:r>
+      <w:r>
+        <w:rPr>
+          <w:lang w:val="en-US"/>
+        </w:rPr>
+        <w:t>…</w:t>
+      </w:r>
+    </w:p>
+    <w:p>
+      <w:pPr>
+        <w:spacing w:line="360" w:lineRule="auto"/>
+        <w:jc w:val="both"/>
+        <w:rPr>
+          <w:lang w:val="en-US"/>
+        </w:rPr>
+      </w:pPr>
+    </w:p>
+    <w:p>
+      <w:pPr>
+        <w:spacing w:line="360" w:lineRule="auto"/>
+        <w:jc w:val="both"/>
+        <w:rPr>
+          <w:lang w:val="en-US"/>
+        </w:rPr>
+      </w:pPr>
+      <w:r>
+        <w:rPr>
+          <w:noProof/>
+          <w:lang w:val="en-US"/>
+        </w:rPr>
+        <w:drawing>
+          <wp:inline distT="0" distB="0" distL="0" distR="0" wp14:anchorId="3BFF6943" wp14:editId="07BD1D98">
+            <wp:extent cx="5731510" cy="4097020"/>
+            <wp:effectExtent l="19050" t="19050" r="21590" b="17780"/>
+            <wp:docPr id="567112144" name="Picture 1"/>
+            <wp:cNvGraphicFramePr>
+              <a:graphicFrameLocks xmlns:a="http://schemas.openxmlformats.org/drawingml/2006/main" noChangeAspect="1"/>
+            </wp:cNvGraphicFramePr>
+            <a:graphic xmlns:a="http://schemas.openxmlformats.org/drawingml/2006/main">
+              <a:graphicData uri="http://schemas.openxmlformats.org/drawingml/2006/picture">
+                <pic:pic xmlns:pic="http://schemas.openxmlformats.org/drawingml/2006/picture">
+                  <pic:nvPicPr>
+                    <pic:cNvPr id="567112144" name="Picture 567112144"/>
+                    <pic:cNvPicPr/>
+                  </pic:nvPicPr>
+                  <pic:blipFill>
+                    <a:blip r:embed="rId6">
+                      <a:extLst>
+                        <a:ext uri="{28A0092B-C50C-407E-A947-70E740481C1C}">
+                          <a14:useLocalDpi xmlns:a14="http://schemas.microsoft.com/office/drawing/2010/main" val="0"/>
+                        </a:ext>
+                      </a:extLst>
+                    </a:blip>
+                    <a:stretch>
+                      <a:fillRect/>
+                    </a:stretch>
+                  </pic:blipFill>
+                  <pic:spPr>
+                    <a:xfrm>
+                      <a:off x="0" y="0"/>
+                      <a:ext cx="5731510" cy="4097020"/>
+                    </a:xfrm>
+                    <a:prstGeom prst="rect">
+                      <a:avLst/>
+                    </a:prstGeom>
+                    <a:ln>
+                      <a:solidFill>
+                        <a:schemeClr val="tx1"/>
+                      </a:solidFill>
+                    </a:ln>
+                  </pic:spPr>
+                </pic:pic>
+              </a:graphicData>
+            </a:graphic>
+          </wp:inline>
+        </w:drawing>
       </w:r>
       <w:r>
         <w:rPr>
@@ -997,47 +1100,7 @@
         <w:t xml:space="preserve"> </w:t>
       </w:r>
       <w:r>
-        <w:t xml:space="preserve">S. </w:t>
-      </w:r>
-      <w:proofErr w:type="spellStart"/>
-      <w:r>
-        <w:t>Wiecha</w:t>
-      </w:r>
-      <w:proofErr w:type="spellEnd"/>
-      <w:r>
-        <w:t xml:space="preserve">, P. S. Kasiak, I. </w:t>
-      </w:r>
-      <w:proofErr w:type="spellStart"/>
-      <w:r>
-        <w:t>Cieśliński</w:t>
-      </w:r>
-      <w:proofErr w:type="spellEnd"/>
-      <w:r>
-        <w:t xml:space="preserve">, M. Maciejczyk, A. </w:t>
-      </w:r>
-      <w:proofErr w:type="spellStart"/>
-      <w:r>
-        <w:t>Mamcarz</w:t>
-      </w:r>
-      <w:proofErr w:type="spellEnd"/>
-      <w:r>
-        <w:t xml:space="preserve">, and D. </w:t>
-      </w:r>
-      <w:proofErr w:type="spellStart"/>
-      <w:r>
-        <w:t>Śliż</w:t>
-      </w:r>
-      <w:proofErr w:type="spellEnd"/>
-      <w:r>
-        <w:t>, “</w:t>
-      </w:r>
-      <w:proofErr w:type="spellStart"/>
-      <w:r>
-        <w:t>Modeling</w:t>
-      </w:r>
-      <w:proofErr w:type="spellEnd"/>
-      <w:r>
-        <w:t xml:space="preserve"> Physiological Predictors of Running Velocity for Endurance Athletes,” </w:t>
+        <w:t xml:space="preserve">S. Wiecha, P. S. Kasiak, I. Cieśliński, M. Maciejczyk, A. Mamcarz, and D. Śliż, “Modeling Physiological Predictors of Running Velocity for Endurance Athletes,” </w:t>
       </w:r>
       <w:r>
         <w:rPr>
@@ -1047,17 +1110,9 @@
         <w:t>JCM</w:t>
       </w:r>
       <w:r>
-        <w:t xml:space="preserve">, vol. 11, no. 22, p. 6688, Nov. 2022, </w:t>
-      </w:r>
-      <w:proofErr w:type="spellStart"/>
-      <w:r>
-        <w:t>doi</w:t>
-      </w:r>
-      <w:proofErr w:type="spellEnd"/>
-      <w:r>
-        <w:t xml:space="preserve">: </w:t>
-      </w:r>
-      <w:hyperlink r:id="rId6" w:history="1">
+        <w:t xml:space="preserve">, vol. 11, no. 22, p. 6688, Nov. 2022, doi: </w:t>
+      </w:r>
+      <w:hyperlink r:id="rId7" w:history="1">
         <w:r>
           <w:rPr>
             <w:rStyle w:val="Hyperlink"/>
@@ -1081,15 +1136,7 @@
         <w:t xml:space="preserve"> </w:t>
       </w:r>
       <w:r>
-        <w:t xml:space="preserve">J. Esteve-Lanao, S. Del Rosso, E. Larumbe-Zabala, C. Cardona, A. Alcocer-Gamboa, and D. A. </w:t>
-      </w:r>
-      <w:proofErr w:type="spellStart"/>
-      <w:r>
-        <w:t>Boullosa</w:t>
-      </w:r>
-      <w:proofErr w:type="spellEnd"/>
-      <w:r>
-        <w:t xml:space="preserve">, “Predicting Recreational Runners’ Marathon Performance Time During Their Training Preparation,” </w:t>
+        <w:t xml:space="preserve">J. Esteve-Lanao, S. Del Rosso, E. Larumbe-Zabala, C. Cardona, A. Alcocer-Gamboa, and D. A. Boullosa, “Predicting Recreational Runners’ Marathon Performance Time During Their Training Preparation,” </w:t>
       </w:r>
       <w:r>
         <w:rPr>
@@ -1099,17 +1146,9 @@
         <w:t>Journal of Strength &amp; Conditioning Research</w:t>
       </w:r>
       <w:r>
-        <w:t xml:space="preserve">, vol. 35, no. 11, pp. 3218–3224, Nov. 2021, </w:t>
-      </w:r>
-      <w:proofErr w:type="spellStart"/>
-      <w:r>
-        <w:t>doi</w:t>
-      </w:r>
-      <w:proofErr w:type="spellEnd"/>
-      <w:r>
-        <w:t xml:space="preserve">: </w:t>
-      </w:r>
-      <w:hyperlink r:id="rId7" w:history="1">
+        <w:t xml:space="preserve">, vol. 35, no. 11, pp. 3218–3224, Nov. 2021, doi: </w:t>
+      </w:r>
+      <w:hyperlink r:id="rId8" w:history="1">
         <w:r>
           <w:rPr>
             <w:rStyle w:val="Hyperlink"/>
@@ -1133,15 +1172,7 @@
         <w:t xml:space="preserve"> </w:t>
       </w:r>
       <w:r>
-        <w:t xml:space="preserve">M. </w:t>
-      </w:r>
-      <w:proofErr w:type="spellStart"/>
-      <w:r>
-        <w:t>Thuany</w:t>
-      </w:r>
-      <w:proofErr w:type="spellEnd"/>
-      <w:r>
-        <w:t xml:space="preserve"> </w:t>
+        <w:t xml:space="preserve">M. Thuany </w:t>
       </w:r>
       <w:r>
         <w:rPr>
@@ -1161,17 +1192,9 @@
         <w:t>Front. Sports Act. Living</w:t>
       </w:r>
       <w:r>
-        <w:t xml:space="preserve">, vol. 7, p. 1577470, Sep. 2025, </w:t>
-      </w:r>
-      <w:proofErr w:type="spellStart"/>
-      <w:r>
-        <w:t>doi</w:t>
-      </w:r>
-      <w:proofErr w:type="spellEnd"/>
-      <w:r>
-        <w:t xml:space="preserve">: </w:t>
-      </w:r>
-      <w:hyperlink r:id="rId8" w:history="1">
+        <w:t xml:space="preserve">, vol. 7, p. 1577470, Sep. 2025, doi: </w:t>
+      </w:r>
+      <w:hyperlink r:id="rId9" w:history="1">
         <w:r>
           <w:rPr>
             <w:rStyle w:val="Hyperlink"/>
@@ -1195,47 +1218,7 @@
         <w:t xml:space="preserve"> </w:t>
       </w:r>
       <w:r>
-        <w:t>J. Martínez-</w:t>
-      </w:r>
-      <w:proofErr w:type="spellStart"/>
-      <w:r>
-        <w:t>Gramage</w:t>
-      </w:r>
-      <w:proofErr w:type="spellEnd"/>
-      <w:r>
-        <w:t xml:space="preserve">, J. P. </w:t>
-      </w:r>
-      <w:proofErr w:type="spellStart"/>
-      <w:r>
-        <w:t>Albiach</w:t>
-      </w:r>
-      <w:proofErr w:type="spellEnd"/>
-      <w:r>
-        <w:t xml:space="preserve">, I. N. </w:t>
-      </w:r>
-      <w:proofErr w:type="spellStart"/>
-      <w:r>
-        <w:t>Moltó</w:t>
-      </w:r>
-      <w:proofErr w:type="spellEnd"/>
-      <w:r>
-        <w:t xml:space="preserve">, J. J. Amer-Cuenca, V. </w:t>
-      </w:r>
-      <w:proofErr w:type="spellStart"/>
-      <w:r>
-        <w:t>Huesa</w:t>
-      </w:r>
-      <w:proofErr w:type="spellEnd"/>
-      <w:r>
-        <w:t xml:space="preserve"> Moreno, and E. Segura-</w:t>
-      </w:r>
-      <w:proofErr w:type="spellStart"/>
-      <w:r>
-        <w:t>Ortí</w:t>
-      </w:r>
-      <w:proofErr w:type="spellEnd"/>
-      <w:r>
-        <w:t xml:space="preserve">, “A Random Forest Machine Learning Framework to Reduce Running Injuries in Young Triathletes,” </w:t>
+        <w:t xml:space="preserve">J. Martínez-Gramage, J. P. Albiach, I. N. Moltó, J. J. Amer-Cuenca, V. Huesa Moreno, and E. Segura-Ortí, “A Random Forest Machine Learning Framework to Reduce Running Injuries in Young Triathletes,” </w:t>
       </w:r>
       <w:r>
         <w:rPr>
@@ -1245,17 +1228,9 @@
         <w:t>Sensors</w:t>
       </w:r>
       <w:r>
-        <w:t xml:space="preserve">, vol. 20, no. 21, p. 6388, Nov. 2020, </w:t>
-      </w:r>
-      <w:proofErr w:type="spellStart"/>
-      <w:r>
-        <w:t>doi</w:t>
-      </w:r>
-      <w:proofErr w:type="spellEnd"/>
-      <w:r>
-        <w:t xml:space="preserve">: </w:t>
-      </w:r>
-      <w:hyperlink r:id="rId9" w:history="1">
+        <w:t xml:space="preserve">, vol. 20, no. 21, p. 6388, Nov. 2020, doi: </w:t>
+      </w:r>
+      <w:hyperlink r:id="rId10" w:history="1">
         <w:r>
           <w:rPr>
             <w:rStyle w:val="Hyperlink"/>
@@ -1279,23 +1254,7 @@
         <w:t xml:space="preserve"> </w:t>
       </w:r>
       <w:r>
-        <w:t xml:space="preserve">A. </w:t>
-      </w:r>
-      <w:proofErr w:type="spellStart"/>
-      <w:r>
-        <w:t>Karahanoğlu</w:t>
-      </w:r>
-      <w:proofErr w:type="spellEnd"/>
-      <w:r>
-        <w:t xml:space="preserve">, R. Gouveia, J. </w:t>
-      </w:r>
-      <w:proofErr w:type="spellStart"/>
-      <w:r>
-        <w:t>Reenalda</w:t>
-      </w:r>
-      <w:proofErr w:type="spellEnd"/>
-      <w:r>
-        <w:t xml:space="preserve">, and G. Ludden, “How Are Sports-Trackers Used by Runners? Running-Related Data, Personal Goals, and Self-Tracking in Running,” </w:t>
+        <w:t xml:space="preserve">A. Karahanoğlu, R. Gouveia, J. Reenalda, and G. Ludden, “How Are Sports-Trackers Used by Runners? Running-Related Data, Personal Goals, and Self-Tracking in Running,” </w:t>
       </w:r>
       <w:r>
         <w:rPr>
@@ -1305,17 +1264,9 @@
         <w:t>Sensors</w:t>
       </w:r>
       <w:r>
-        <w:t xml:space="preserve">, vol. 21, no. 11, p. 3687, May 2021, </w:t>
-      </w:r>
-      <w:proofErr w:type="spellStart"/>
-      <w:r>
-        <w:t>doi</w:t>
-      </w:r>
-      <w:proofErr w:type="spellEnd"/>
-      <w:r>
-        <w:t xml:space="preserve">: </w:t>
-      </w:r>
-      <w:hyperlink r:id="rId10" w:history="1">
+        <w:t xml:space="preserve">, vol. 21, no. 11, p. 3687, May 2021, doi: </w:t>
+      </w:r>
+      <w:hyperlink r:id="rId11" w:history="1">
         <w:r>
           <w:rPr>
             <w:rStyle w:val="Hyperlink"/>
@@ -1339,76 +1290,19 @@
         <w:t xml:space="preserve"> </w:t>
       </w:r>
       <w:r>
-        <w:t xml:space="preserve">M. </w:t>
-      </w:r>
-      <w:proofErr w:type="spellStart"/>
-      <w:r>
-        <w:t>Pobiruchin</w:t>
-      </w:r>
-      <w:proofErr w:type="spellEnd"/>
-      <w:r>
-        <w:t xml:space="preserve">, J. </w:t>
-      </w:r>
-      <w:proofErr w:type="spellStart"/>
-      <w:r>
-        <w:t>Suleder</w:t>
-      </w:r>
-      <w:proofErr w:type="spellEnd"/>
-      <w:r>
-        <w:t xml:space="preserve">, R. </w:t>
-      </w:r>
-      <w:proofErr w:type="spellStart"/>
-      <w:r>
-        <w:t>Zowalla</w:t>
-      </w:r>
-      <w:proofErr w:type="spellEnd"/>
-      <w:r>
-        <w:t xml:space="preserve">, and M. Wiesner, “Accuracy and Adoption of Wearable Technology Used by Active Citizens: A Marathon Event Field Study,” </w:t>
+        <w:t xml:space="preserve">M. Pobiruchin, J. Suleder, R. Zowalla, and M. Wiesner, “Accuracy and Adoption of Wearable Technology Used by Active Citizens: A Marathon Event Field Study,” </w:t>
       </w:r>
       <w:r>
         <w:rPr>
           <w:i/>
           <w:iCs/>
         </w:rPr>
-        <w:t xml:space="preserve">JMIR </w:t>
-      </w:r>
-      <w:proofErr w:type="spellStart"/>
-      <w:r>
-        <w:rPr>
-          <w:i/>
-          <w:iCs/>
-        </w:rPr>
-        <w:t>Mhealth</w:t>
-      </w:r>
-      <w:proofErr w:type="spellEnd"/>
-      <w:r>
-        <w:rPr>
-          <w:i/>
-          <w:iCs/>
-        </w:rPr>
-        <w:t xml:space="preserve"> </w:t>
-      </w:r>
-      <w:proofErr w:type="spellStart"/>
-      <w:r>
-        <w:rPr>
-          <w:i/>
-          <w:iCs/>
-        </w:rPr>
-        <w:t>Uhealth</w:t>
-      </w:r>
-      <w:proofErr w:type="spellEnd"/>
-      <w:r>
-        <w:t xml:space="preserve">, vol. 5, no. 2, p. e24, Feb. 2017, </w:t>
-      </w:r>
-      <w:proofErr w:type="spellStart"/>
-      <w:r>
-        <w:t>doi</w:t>
-      </w:r>
-      <w:proofErr w:type="spellEnd"/>
-      <w:r>
-        <w:t xml:space="preserve">: </w:t>
-      </w:r>
-      <w:hyperlink r:id="rId11" w:history="1">
+        <w:t>JMIR Mhealth Uhealth</w:t>
+      </w:r>
+      <w:r>
+        <w:t xml:space="preserve">, vol. 5, no. 2, p. e24, Feb. 2017, doi: </w:t>
+      </w:r>
+      <w:hyperlink r:id="rId12" w:history="1">
         <w:r>
           <w:rPr>
             <w:rStyle w:val="Hyperlink"/>
@@ -1432,15 +1326,7 @@
         <w:t xml:space="preserve"> </w:t>
       </w:r>
       <w:r>
-        <w:t xml:space="preserve">M. S. </w:t>
-      </w:r>
-      <w:proofErr w:type="spellStart"/>
-      <w:r>
-        <w:t>Sainin</w:t>
-      </w:r>
-      <w:proofErr w:type="spellEnd"/>
-      <w:r>
-        <w:t xml:space="preserve">, “Regression-based Finish Time Prediction of 100km Trail Running using Structured Athlete Performance,” in </w:t>
+        <w:t xml:space="preserve">M. S. Sainin, “Regression-based Finish Time Prediction of 100km Trail Running using Structured Athlete Performance,” in </w:t>
       </w:r>
       <w:r>
         <w:rPr>
@@ -1450,17 +1336,9 @@
         <w:t>2025 International Conference on Advances in Machine Intelligence, and Cybersecurity Technologies (AMICT)</w:t>
       </w:r>
       <w:r>
-        <w:t xml:space="preserve">, Kota Kinabalu, Sabah, Malaysia: IEEE, Nov. 2025, pp. 290–295. </w:t>
-      </w:r>
-      <w:proofErr w:type="spellStart"/>
-      <w:r>
-        <w:t>doi</w:t>
-      </w:r>
-      <w:proofErr w:type="spellEnd"/>
-      <w:r>
-        <w:t xml:space="preserve">: </w:t>
-      </w:r>
-      <w:hyperlink r:id="rId12" w:history="1">
+        <w:t xml:space="preserve">, Kota Kinabalu, Sabah, Malaysia: IEEE, Nov. 2025, pp. 290–295. doi: </w:t>
+      </w:r>
+      <w:hyperlink r:id="rId13" w:history="1">
         <w:r>
           <w:rPr>
             <w:rStyle w:val="Hyperlink"/>
@@ -1476,73 +1354,73 @@
       <w:pPr>
         <w:spacing w:line="360" w:lineRule="auto"/>
         <w:jc w:val="both"/>
+        <w:rPr>
+          <w:lang w:val="en-MT"/>
+        </w:rPr>
       </w:pPr>
       <w:r>
-        <w:t xml:space="preserve">[8] </w:t>
+        <w:t>[8]</w:t>
+      </w:r>
+      <w:r>
+        <w:t xml:space="preserve"> </w:t>
+      </w:r>
+      <w:r>
+        <w:rPr>
+          <w:lang w:val="en-MT"/>
+        </w:rPr>
+        <w:t xml:space="preserve">J. W. Creswell and J. D. Creswell, </w:t>
+      </w:r>
+      <w:r>
+        <w:rPr>
+          <w:i/>
+          <w:iCs/>
+          <w:lang w:val="en-MT"/>
+        </w:rPr>
+        <w:t>Research design: qualitative, quantitative, and mixed methods approaches</w:t>
+      </w:r>
+      <w:r>
+        <w:rPr>
+          <w:lang w:val="en-MT"/>
+        </w:rPr>
+        <w:t>, Sixth edition. Los Angeles: SAGE, 2023.</w:t>
       </w:r>
     </w:p>
     <w:p>
       <w:pPr>
         <w:jc w:val="both"/>
-        <w:rPr>
-          <w:lang w:val="en-MT"/>
-        </w:rPr>
       </w:pPr>
       <w:r>
-        <w:rPr>
-          <w:lang w:val="en-MT"/>
-        </w:rPr>
         <w:t>[</w:t>
       </w:r>
       <w:r>
-        <w:rPr>
-          <w:lang w:val="en-MT"/>
-        </w:rPr>
         <w:t>9</w:t>
       </w:r>
       <w:r>
-        <w:rPr>
-          <w:lang w:val="en-MT"/>
-        </w:rPr>
         <w:t>]</w:t>
       </w:r>
       <w:r>
-        <w:rPr>
-          <w:lang w:val="en-MT"/>
-        </w:rPr>
         <w:t xml:space="preserve"> </w:t>
       </w:r>
       <w:r>
-        <w:rPr>
-          <w:lang w:val="en-MT"/>
-        </w:rPr>
         <w:t xml:space="preserve">M. N. K. Saunders, P. Lewis, and A. Thornhill, </w:t>
       </w:r>
       <w:r>
         <w:rPr>
           <w:i/>
           <w:iCs/>
-          <w:lang w:val="en-MT"/>
         </w:rPr>
         <w:t>Research methods for business students</w:t>
       </w:r>
       <w:r>
-        <w:rPr>
-          <w:lang w:val="en-MT"/>
-        </w:rPr>
         <w:t>, Ninth edition. Harlow, England</w:t>
       </w:r>
       <w:r>
         <w:rPr>
           <w:rFonts w:ascii="Arial" w:hAnsi="Arial" w:cs="Arial"/>
-          <w:lang w:val="en-MT"/>
         </w:rPr>
         <w:t> </w:t>
       </w:r>
       <w:r>
-        <w:rPr>
-          <w:lang w:val="en-MT"/>
-        </w:rPr>
         <w:t>; New York: Pearson, 2023.</w:t>
       </w:r>
     </w:p>
@@ -1553,8 +1431,8 @@
     </w:p>
     <w:p/>
     <w:sectPr>
-      <w:headerReference w:type="default" r:id="rId13"/>
-      <w:footerReference w:type="default" r:id="rId14"/>
+      <w:headerReference w:type="default" r:id="rId14"/>
+      <w:footerReference w:type="default" r:id="rId15"/>
       <w:pgSz w:w="11906" w:h="16838"/>
       <w:pgMar w:top="1440" w:right="1440" w:bottom="1440" w:left="1440" w:header="708" w:footer="708" w:gutter="0"/>
       <w:cols w:space="708"/>

</xml_diff>